<commit_message>
docs: document meta-progression (profile, leveling, shop, loadout)
Sync all docs to the new systems: CLAUDE.md scope, docs/architecture.md (STATE
enum + SHOP, loadout-driven allies), docs/systems.md (skills are now a profile
loadout, not the fixed per-class kit), docs/session-changes.md (full entry). Add
update_overview.py entries (idempotent) and regenerate Game-Overview.docx.

Co-Authored-By: Claude Opus 4.7 (1M context) <noreply@anthropic.com>
</commit_message>
<xml_diff>
--- a/Game-Overview.docx
+++ b/Game-Overview.docx
@@ -100,7 +100,7 @@
         <w:pStyle w:val="ListBullet"/>
       </w:pPr>
       <w:r>
-        <w:t>STATE enum: MENU, HOWTO, PLAYING, LEVEL_COMPLETE, GAME_OVER, VICTORY, CHARACTER_SELECT, ASSISTANT_SELECT. Both update() and draw() dispatch on the state variable.</w:t>
+        <w:t>STATE enum: MENU, HOWTO, PLAYING, LEVEL_COMPLETE, GAME_OVER, VICTORY, CHARACTER_SELECT, ASSISTANT_SELECT, SHOP. Both update() and draw() dispatch on the state variable.</w:t>
       </w:r>
     </w:p>
     <w:p>
@@ -108,7 +108,7 @@
         <w:pStyle w:val="ListBullet"/>
       </w:pPr>
       <w:r>
-        <w:t>Run setup flow: MENU (pick level) -&gt; CHARACTER_SELECT (pick class) -&gt; ASSISTANT_SELECT (pick exactly 2 of 5) -&gt; PLAYING. The real entry point is startSelectedRun() (uses selectedChar + selectedLevel).</w:t>
+        <w:t>Run setup flow: MENU (pick level) -&gt; CHARACTER_SELECT (pick class) -&gt; ASSISTANT_SELECT (the LOADOUT screen: equip 0-2 OWNED assistants + assign owned skills to X/C/B/V) -&gt; PLAYING. SHOP (the ARMORY) opens from a lower-left MENU button. The real entry point is startSelectedRun() (uses selectedChar + selectedLevel + the persistent profile).</w:t>
       </w:r>
     </w:p>
     <w:p>
@@ -167,7 +167,7 @@
     </w:p>
     <w:p>
       <w:r>
-        <w:t>Three classes; class keys never change (soldier/scout/tank) so all logic keys off them. Display names and live stats:</w:t>
+        <w:t>Three classes; class keys never change (soldier/scout/tank) so all logic keys off them. Each keeps a class-locked LMB + held-RMB; the active X/C/B/V skills are now a PROFILE LOADOUT (F=HEAL locked, +1 slot per 5 levels) drawn from the SKILLS catalog, NOT the per-class CHARACTERS.skills kit (now vestigial / kept only for validator C7). Display names and live stats:</w:t>
       </w:r>
     </w:p>
     <w:tbl>
@@ -623,6 +623,30 @@
       </w:pPr>
       <w:r>
         <w:t>Benjamin Wu - +0.2 fuel per kill: in killEnemy after the idempotency guard, credits once per kill.</w:t>
+      </w:r>
+    </w:p>
+    <w:p>
+      <w:pPr>
+        <w:pStyle w:val="ListBullet"/>
+      </w:pPr>
+      <w:r>
+        <w:t>META-PROGRESSION (persistent): one shared account profile in localStorage (shooter_profile) - level, XP, gold, owned skills + assistants, the X/C/B/V loadout, and equipped assistants. XP earned on ANY character credits the one profile, so all characters level together. loadProfile() guards a non-string (headless stubs localStorage as a Proxy).</w:t>
+      </w:r>
+    </w:p>
+    <w:p>
+      <w:pPr>
+        <w:pStyle w:val="ListBullet"/>
+      </w:pPr>
+      <w:r>
+        <w:t>LEVELING + SCALING: XP from kills (small, accrued) + level-clear/victory (banked); xpToNext grows geometrically (cap 40). applyLevelScaling() at run start raises base damage, fire rate / attack speed, max HP, and the held-RMB 'second basic attack' DURATION (its fuel/energy/power pool starts short and grows with level). Drop rate also scales up with level (gate only).</w:t>
+      </w:r>
+    </w:p>
+    <w:p>
+      <w:pPr>
+        <w:pStyle w:val="ListBullet"/>
+      </w:pPr>
+      <w:r>
+        <w:t>SHOP (STATE.SHOP, the ARMORY): spend Gold on tiered skills (cheap/small -&gt; expensive/big) and extra assistants; purchases persist. LOADOUT screen: F is locked to HEAL, X/C/B/V unlock +1 per 5 levels and are filled from owned skills; the persistent LV/XP bar + gold show upper-right on every menu.</w:t>
       </w:r>
     </w:p>
     <w:p>
@@ -1524,7 +1548,7 @@
     </w:p>
     <w:p>
       <w:r>
-        <w:t>Roster in ASSISTANTS (drone, henchman, nunchaku, bomber, poison); player picks exactly 2 (selectedAssistants). Spawned at run start (spawnSelectedAssistants) and rebuilt each level (refreshAssistants - survivors refilled, dead recreated). All fire/swing as owner:player with fromAlly:true. isAlly(e) gates collisions, prune, and the per-level keep filter.</w:t>
+        <w:t>Roster in ASSISTANTS (drone, henchman, nunchaku, bomber, poison); the player OWNS a default drone + any bought in the SHOP, and EQUIPS 0-2 of them on the loadout screen (profile.equippedAssistants; default removable - the old exactly-2 rule is gone). startSelectedRun seeds selectedAssistants from the profile; spawned at run start (spawnSelectedAssistants) and rebuilt each level (refreshAssistants - survivors refilled, dead recreated).</w:t>
       </w:r>
     </w:p>
     <w:p>

</xml_diff>

<commit_message>
feat: PARAMETERS button on the menu — base stats + per-level growth
Adds a PARAMETERS button to the main menu (top-right, just below the
profile bar's COINS line) opening a new STATE.PARAMETERS screen, so the
character's basic parameters are visible from the initial interface, not
only via the in-run Tab window.

The screen has three class tabs and shows each stat's CURRENT level-scaled
value plus its gain per account level as a (+x) token. With no live player
on the menu, values come from a new pure helper scaledStatsFor(charKey,
level) that mirrors applyLevelScaling/createPlayer; the per-level delta is
just that helper at level vs level+1 (clamped to LEVEL_CAP, so tokens read
(+0) at max). Non-scaling stats (move speed, shield, regen, lifesteal) show
(+0); the Scout's fixed-0.06 LMB cadence makes its fire-rate gain (+0) too.

headless_check.py draws the screen for all three class tabs.

Co-Authored-By: Claude Opus 4.7 (1M context) <noreply@anthropic.com>
</commit_message>
<xml_diff>
--- a/Game-Overview.docx
+++ b/Game-Overview.docx
@@ -31,7 +31,7 @@
     </w:p>
     <w:p>
       <w:r>
-        <w:t>The entire game is one file: index.html (~5,669 lines). One &lt;script&gt; block, vanilla JS, no build, no dependencies, no external assets. Sprites are inline ASCII-art arrays; all SFX are synthesized via Web Audio. It deploys by pushing to main (GitHub Pages serves the raw file).</w:t>
+        <w:t>The entire game is one file: index.html (~5,873 lines). One &lt;script&gt; block, vanilla JS, no build, no dependencies, no external assets. Sprites are inline ASCII-art arrays; all SFX are synthesized via Web Audio. It deploys by pushing to main (GitHub Pages serves the raw file).</w:t>
       </w:r>
     </w:p>
     <w:p>
@@ -655,6 +655,14 @@
       </w:pPr>
       <w:r>
         <w:t>CHARACTER STATS window (Tab): during play, Tab opens a screen-space panel of the character's LIVE, level-scaled basic parameters - HP, shield, move speed, primary (LMB) and secondary (RMB) attack damage + fire cadence, the FUEL/ENERGY/POWER pool capacity (= second-attack capacity) and its per-second regen, the overall damage multiplier, Soldier lifesteal, and account level. It freezes the tick like pause (update() skips updatePlaying while showStats); Tab/Esc/click closes it. HP-regen is shown only for the Scout (0.5%/s) - the others read '-', because there is no universal HP-per-second regen.</w:t>
+      </w:r>
+    </w:p>
+    <w:p>
+      <w:pPr>
+        <w:pStyle w:val="ListBullet"/>
+      </w:pPr>
+      <w:r>
+        <w:t>CHARACTER PARAMETERS screen (STATE.PARAMETERS): a PARAMETERS button on the MENU (top-right, just below the profile bar's COINS line) opens a menu-side version of the same readout, with three class tabs. Since there is no live player on the menu, values come from scaledStatsFor(charKey, level) - a pure mirror of applyLevelScaling - and each numeric row also shows its GAIN PER ACCOUNT LEVEL as a (+x) token (computed by diffing the helper at level vs level+1; '(+0)' for stats that don't scale, like move speed / shield / regen / lifesteal).</w:t>
       </w:r>
     </w:p>
     <w:p>

</xml_diff>

<commit_message>
docs: sync architecture/systems docs + README + Game-Overview for staged bosses
Updates the prose docs to match the staged-boss overhaul: architecture.md
(LEVELS bullet -> staged bossPhase machine + 4-phase scaling + new enemies/
bosses; ENEMY AI list; SPAWNING gate), session-changes.md (full changelog
entry), README.md (Progression/scaling bullets), and Game-Overview.docx via
tools/update_overview.py (4-phase curve, staged encounters, new boss AIs,
~23 headless assertions; +2 idempotent rewrite-in-place entries). Updater
re-run is idempotent (5 edits, then 0).

Co-Authored-By: Claude Opus 4.7 (1M context) <noreply@anthropic.com>
</commit_message>
<xml_diff>
--- a/Game-Overview.docx
+++ b/Game-Overview.docx
@@ -31,7 +31,7 @@
     </w:p>
     <w:p>
       <w:r>
-        <w:t>The entire game is one file: index.html (~5,963 lines). One &lt;script&gt; block, vanilla JS, no build, no dependencies, no external assets. Sprites are inline ASCII-art arrays; all SFX are synthesized via Web Audio. It deploys by pushing to main (GitHub Pages serves the raw file).</w:t>
+        <w:t>The entire game is one file: index.html (~6,224 lines). One &lt;script&gt; block, vanilla JS, no build, no dependencies, no external assets. Sprites are inline ASCII-art arrays; all SFX are synthesized via Web Audio. It deploys by pushing to main (GitHub Pages serves the raw file).</w:t>
       </w:r>
     </w:p>
     <w:p>
@@ -1551,7 +1551,7 @@
           <w:b/>
           <w:color w:val="C0392B"/>
         </w:rPr>
-        <w:t>updateTwin and updateBomber are no longer orphaned - they are the L31-L40 MID-BOSSES (see the mid-boss bullets below). Each L31-40 level carries a midBoss field (twin/bomber/splitter/reaper), a DIFFERENT kind than its end boss.</w:t>
+        <w:t>updateTwin and updateBomber are no longer orphaned - they are reused as medium/transitional bosses in the staged L11-40 encounters, alongside two NEW boss AIs (updateWarden, updateHarrier) used ONLY as medium/transitional bosses. Each L11-40 level carries midBoss (+ midBoss2 from L21, + transBoss on L31-40) naming the medium/transitional kinds, each a DIFFERENT kind than its end boss.</w:t>
       </w:r>
     </w:p>
     <w:p>
@@ -1567,7 +1567,7 @@
         <w:pStyle w:val="ListBullet"/>
       </w:pPr>
       <w:r>
-        <w:t>L31-L40 mid-boss + gap: a mid-boss (twin/bomber/splitter/reaper, a different kind than the end boss) spawns at 50% spawn progress. The end boss NEVER co-exists with it - it is held back until the mid-boss DIES plus a 15-30s gap (bossGapTimer), during which a trickle of monsters keeps spawning so the arena is never empty.</w:t>
+        <w:t>STAGED boss encounters by 10-level block (bossPhase state machine): L1-10 end boss only; L11-20 one medium boss at 50% progress, then a surge gap, then the end boss; L21-30 two DIFFERENT mediums simultaneously, surge gap, end boss; L31-40 two mediums, surge gap, a transitional boss, then the end boss IMMEDIATELY (0s) on its death. Bosses never co-exist. The surge gap is rand(10,15)s and floods the arena with a DENSE wave of monsters (alive cap 28). Medium/transitional kinds reuse existing AIs plus two NEW boss AIs (warden, harrier) that are never tier end bosses, so validator C6's locked order is untouched.</w:t>
       </w:r>
     </w:p>
     <w:p>
@@ -1575,7 +1575,7 @@
         <w:pStyle w:val="ListBullet"/>
       </w:pPr>
       <w:r>
-        <w:t>THREE-PHASE difficulty curve (difficultyRamp / enemyScale / bossHpScale / bossSpdScale): scaling is gentle through L1-15, ramps moderately L16-24, then spikes sharply L25-40 so the late game depends on meta-progression upgrades. DROP variety is also level-gated in killEnemy - basic &amp; sparse in L1-15 (health/resource/rapid/shield), widening at L16 (pierce/multi/damage/speed/magnet) and L25 (full pool) - while the static drop arrays still sum to 1.0 (validator C5) and the runtime filter renormalizes.</w:t>
+        <w:t>FOUR-PHASE difficulty curve (difficultyRamp / enemyScale / bossHpScale / bossSpdScale): scaling is gentle through L1-15, moderate L16-24, sharp L25-30, then a STEEP L31-40 spike so the late game depends on meta-progression upgrades. The enemy HP/speed ramp's per-level step is capped at 0.2, so most of the L31-40 spike is carried by boss HP/speed plus enemyDmgScale(idx) (1.0 through L30, up to ~2.2 at L40, applied to enemy contact/bullet/gas damage). Two new regular enemies join the L11-40 spawn mixes: weaver (evasive bullet-dodger) and spitter (drops telegraphed poison pools). DROP variety is also level-gated in killEnemy - basic &amp; sparse in L1-15 (health/resource/rapid/shield), widening at L16 (pierce/multi/damage/speed/magnet) and L25 (full pool) - while the static drop arrays still sum to 1.0 (validator C5) and the runtime filter renormalizes.</w:t>
       </w:r>
     </w:p>
     <w:p>
@@ -1702,7 +1702,7 @@
     </w:p>
     <w:p>
       <w:r>
-        <w:t>tools/validate.py (pure stdlib) is a static invariant linter (not runtime): one &lt;script&gt;, brace balance, 40 levels, every mix sums to 1.0 (C4), all 3 drop pools sum to 1.0 (C5), boss tiers, skill wiring, GAMEPLAY_KEYS coverage. Run python tools/validate.py after editing LEVELS, drop pools, skills, or keys; CI runs it on push as a signal only (it never blocks the Pages deploy). There is ALSO an optional (non-CI) runtime + balance check, tools/headless_check.py (needs pip install py_mini_racer): it executes the game in V8 with a stubbed canvas/DOM across all 40 levels and asserts ~18 balance properties - including the new 'end boss waits 15-30s after the mid-boss dies, with monsters filling the gap'.</w:t>
+        <w:t>tools/validate.py (pure stdlib) is a static invariant linter (not runtime): one &lt;script&gt;, brace balance, 40 levels, every mix sums to 1.0 (C4), all 3 drop pools sum to 1.0 (C5), boss tiers, skill wiring, GAMEPLAY_KEYS coverage. Run python tools/validate.py after editing LEVELS, drop pools, skills, or keys; CI runs it on push as a signal only (it never blocks the Pages deploy). There is ALSO an optional (non-CI) runtime + balance check, tools/headless_check.py (needs pip install py_mini_racer): it executes the game in V8 with a stubbed canvas/DOM across all 40 levels and checks ~23 balance properties - including the STAGED boss flow (1/2/3 mediums by block, the 10-15s surge gap, and the L31-40 0s transitional-to-final handoff).</w:t>
       </w:r>
     </w:p>
     <w:p>

</xml_diff>

<commit_message>
docs: sync Game-Overview for 5-class roster + weapon tiers + shake removal
The overview had drifted ~50 commits behind. Re-keyed/added curated edits in
tools/update_overview.py and re-ran it (idempotent) to cover the substantive
gameplay changes since the last sync: roster expanded 3->5 classes (Leo +
Ong, their LMB/RMB, FURY/TOXIN pools, protein/isotope pickups, poison_cloud
entity, 4 new skills), the universal 5-tier weapon-evolution multiplier, the
3->5 shared-template drop pools (RES map / C5), the fully-removed screen-shake
system, the ~30 headless balance properties, and the ~8,111 line count.

Co-Authored-By: Claude Opus 4.8 (1M context) <noreply@anthropic.com>
</commit_message>
<xml_diff>
--- a/Game-Overview.docx
+++ b/Game-Overview.docx
@@ -31,7 +31,7 @@
     </w:p>
     <w:p>
       <w:r>
-        <w:t>The entire game is one file: index.html (~6,224 lines). One &lt;script&gt; block, vanilla JS, no build, no dependencies, no external assets. Sprites are inline ASCII-art arrays; all SFX are synthesized via Web Audio. It deploys by pushing to main (GitHub Pages serves the raw file).</w:t>
+        <w:t>The entire game is one file: index.html (~8,111 lines). One &lt;script&gt; block, vanilla JS, no build, no dependencies, no external assets. Sprites are inline ASCII-art arrays; all SFX are synthesized via Web Audio. It deploys by pushing to main (GitHub Pages serves the raw file). FIVE playable classes now ship (Dr. Syed / Xu Yihui / Benjamin Wu / Leo / Ong).</w:t>
       </w:r>
     </w:p>
     <w:p>
@@ -167,7 +167,7 @@
     </w:p>
     <w:p>
       <w:r>
-        <w:t>Three classes; class keys never change (soldier/scout/tank) so all logic keys off them. Each keeps a class-locked LMB + held-RMB; the active X/C/B/V skills are now a PROFILE LOADOUT (F=HEAL locked, +1 slot per 5 levels) drawn from the SKILLS catalog, NOT the per-class CHARACTERS.skills kit (now vestigial / kept only for validator C7). Display names and live stats:</w:t>
+        <w:t>FIVE classes; class keys never change (soldier/scout/tank/bounty_hunter/cyborg, display names Dr. Syed / Xu Yihui / Benjamin Wu / Leo / Ong) so all logic keys off them. Each keeps a class-locked LMB + held-RMB secondary; the active X/C/B/V skills are a PROFILE LOADOUT (F=HEAL locked, +1 slot per 5 levels) drawn from the SKILLS catalog, NOT the per-class CHARACTERS.skills kit (vestigial / kept only for validator C7). Display names and live stats:</w:t>
       </w:r>
     </w:p>
     <w:tbl>
@@ -699,6 +699,30 @@
     </w:p>
     <w:p>
       <w:pPr>
+        <w:pStyle w:val="ListBullet"/>
+      </w:pPr>
+      <w:r>
+        <w:t>ROSTER EXPANDED 3 -&gt; 5 PLAYABLE CLASSES. Leo (key bounty_hunter; HP 11 / speed 120 / dmg x1.3, no shield): SHOTGUN LMB (3-pellet point-blank spread, slow cadence) + MACHETE RMB (fireMachete - a hold-to-combo swept slash with ~2x reach) draining a FURY pool (6, refilled by the protein pickup; C=grit, V=fanfire). Ong (key cyborg; HP 10 / speed 140 / dmg x1.15 / 2 start-shield): GAS-GUN LMB (green gas bolt) + BIO-GUN RMB (fireBiogun lobs a glob that bursts into a lingering poison_cloud DoT) draining a TOXIN pool (12, refilled by isotope; C=overclock, V=biobomb). Both ship at BASE form (no bespoke per-class weapon evolution beyond the universal weapon-tier multiplier).</w:t>
+      </w:r>
+    </w:p>
+    <w:p>
+      <w:pPr>
+        <w:pStyle w:val="ListBullet"/>
+      </w:pPr>
+      <w:r>
+        <w:t>NEW poison_cloud ENTITY (player-owned lingering AoE DoT: base radius 24 / 2s / 6 dps; its params ride on the spawning bullet) - NOT an ally; wired into the entity update + draw dispatch, the player-bullet-&gt;enemy collision, and bullet expiry; cap-gated and dropped between levels. FOUR new universally-equippable 5-tier skills came with the new classes: grit (temp shield + i-frames), overclock (self rapid-fire), fanfire (wide high-dmg shotgun fan), biobomb (drops a big poison cloud) - bought/upgraded in the shop and equippable into any X/C/B/V slot, so no new GAMEPLAY_KEYS.</w:t>
+      </w:r>
+    </w:p>
+    <w:p>
+      <w:pPr>
+        <w:pStyle w:val="ListBullet"/>
+      </w:pPr>
+      <w:r>
+        <w:t>5-TIER WEAPON EVOLUTION (account-level, separate from the active-skill tiers): weaponTierFor(level) = min(5, floor((level-1)/8)+1), so tiers 1/2/3/4/5 unlock at account level 1/9/17/25/33, with WEAPON_TIER_MULT = [1.0, 1.2, 1.5, 1.9, 2.5] multiplying the BASIC-ATTACK (LMB + held-RMB) base DAMAGE and projectile SPEED. It is cached on the player at run start (applyLevelScaling -&gt; player.weaponTier/weaponMult), stacks multiplicatively with the DAMAGE pickup (x2), and is independent of RAPID (cadence only). The Tab stats window shows a WEAPON TIER row (Tier n / 5).</w:t>
+      </w:r>
+    </w:p>
+    <w:p>
+      <w:pPr>
         <w:pStyle w:val="Heading1"/>
       </w:pPr>
       <w:r>
@@ -1016,7 +1040,7 @@
     </w:p>
     <w:p>
       <w:r>
-        <w:t>Pickups (applyPickup): WEAPON ENHANCERS (timed ~8s, never change the attack's form) - rapid (half cooldown), pierce (shots punch through), multi (single -&gt; double shot), damage (2x); defenses - health, shield, armor; utility powerups - speed, slowmo, score2x, magnet; class resources - fuel, beverage, battery. The 6 old form-changing weapons (rocket/laser/plasma/minigun/spread/homing) were removed as pickups. Three drop pools in killEnemy (Tank-&gt;fuel, Soldier-&gt;beverage, Scout-&gt;battery), each MUST sum to 1.0 (validator C5). 22% drop chance per non-boss kill (55% for elite mini-bosses). Bosses give a guaranteed enhancer/defense drop plus a health.</w:t>
+        <w:t>Pickups (applyPickup): WEAPON ENHANCERS (timed ~8s, never change the attack's form) - rapid (half cooldown), pierce (shots punch through), multi (single -&gt; double shot), damage (2x); defenses - health, shield, armor; utility powerups - speed, slowmo, score2x, magnet; class resources - fuel, beverage, battery, protein, isotope. FIVE drop pools now (one per class), built from ONE shared kinds/weights template with only the class resource swapped (RES map: tank-&gt;fuel, soldier-&gt;beverage, scout-&gt;battery, bounty_hunter-&gt;protein, cyborg-&gt;isotope), so every pool sums to 1.0 by construction (validator C5). ~22% drop chance per non-boss kill (more for elite mini-bosses); bosses give a guaranteed enhancer/defense drop plus a health. Drop VARIETY stays level-gated (basic in L1-15, widening at L16 and L25, renormalized).</w:t>
       </w:r>
     </w:p>
     <w:p>
@@ -1681,7 +1705,7 @@
         <w:pStyle w:val="ListBullet"/>
       </w:pPr>
       <w:r>
-        <w:t>Screen shake is disabled - draw() no longer applies the translate; combat still sets shakeTime/shakeAmt harmlessly (one-line revert to re-enable).</w:t>
+        <w:t>The screen-shake system was COMPLETELY REMOVED: there is no setShake / shakeTime / shakeAmt anymore and draw() applies no recoil offset, so the camera and HUD are perfectly stable. The brief HD-vector/bloom experiment was also rolled back - rendering is crisp pixel-art again (imageSmoothingEnabled=false).</w:t>
       </w:r>
     </w:p>
     <w:p>
@@ -1718,7 +1742,7 @@
     </w:p>
     <w:p>
       <w:r>
-        <w:t>tools/validate.py (pure stdlib) is a static invariant linter (not runtime): one &lt;script&gt;, brace balance, 40 levels, every mix sums to 1.0 (C4), all 3 drop pools sum to 1.0 (C5), boss tiers, skill wiring, GAMEPLAY_KEYS coverage. Run python tools/validate.py after editing LEVELS, drop pools, skills, or keys; CI runs it on push as a signal only (it never blocks the Pages deploy). There is ALSO an optional (non-CI) runtime + balance check, tools/headless_check.py (needs pip install py_mini_racer): it executes the game in V8 with a stubbed canvas/DOM across all 40 levels and checks ~23 balance properties - including the STAGED boss flow (1/2/3 mediums by block, the 10-15s surge gap, and the L31-40 0s transitional-to-final handoff).</w:t>
+        <w:t>tools/validate.py (pure stdlib) is a static invariant linter (not runtime): one &lt;script&gt;, brace balance, 40 levels, every mix sums to 1.0 (C4), the SHARED drop template sums to 1.0 + the RES map covers all 5 characters (C5), boss tiers, skill wiring, GAMEPLAY_KEYS coverage, plus the passive catalog (C10). Run python tools/validate.py after editing LEVELS, drop pools, skills, or keys; CI runs it on push as a signal only (it never blocks the Pages deploy). There is ALSO an optional (non-CI) runtime + balance check, tools/headless_check.py (needs pip install py_mini_racer): it executes the game in V8 with a stubbed canvas/DOM across all 40 levels and checks ~30 balance properties - including the STAGED boss flow, the surge gap, and the L31-40 0s transitional-to-final handoff.</w:t>
       </w:r>
     </w:p>
     <w:p>

</xml_diff>

<commit_message>
docs: sync Game-Overview for weapon-swap shop, Xu Purple Core, lean stats
Catches the doc up with the 8 commits since the last sync (19108fd):
- per-character WEAPONS swap shop (ARMORY 4th tab) + Stage-1 buffs
- Xu Purple Core blue->purple recolor + fluorescent purple LMB bullets
- lean L1 base stats + NEW per-level move-speed growth (+1/level, cap +35)
- line count ~8,111 -> ~9,112; PARAMETERS now notes MOVE SPEED scales
  + has FIVE class tabs

Co-Authored-By: Claude Opus 4.8 <noreply@anthropic.com>
</commit_message>
<xml_diff>
--- a/Game-Overview.docx
+++ b/Game-Overview.docx
@@ -31,7 +31,7 @@
     </w:p>
     <w:p>
       <w:r>
-        <w:t>The entire game is one file: index.html (~8,111 lines). One &lt;script&gt; block, vanilla JS, no build, no dependencies, no external assets. Sprites are inline ASCII-art arrays; all SFX are synthesized via Web Audio. It deploys by pushing to main (GitHub Pages serves the raw file). FIVE playable classes now ship (Dr. Syed / Xu Yihui / Benjamin Wu / Leo / Ong).</w:t>
+        <w:t>The entire game is one file: index.html (~9,112 lines). One &lt;script&gt; block, vanilla JS, no build, no dependencies, no external assets. Sprites are inline ASCII-art arrays; all SFX are synthesized via Web Audio. It deploys by pushing to main (GitHub Pages serves the raw file). FIVE playable classes now ship (Dr. Syed / Xu Yihui / Benjamin Wu / Leo / Ong).</w:t>
       </w:r>
     </w:p>
     <w:p>
@@ -662,7 +662,7 @@
         <w:pStyle w:val="ListBullet"/>
       </w:pPr>
       <w:r>
-        <w:t>CHARACTER PARAMETERS screen (STATE.PARAMETERS): a PARAMETERS button on the MENU (top-right, just below the profile bar's COINS line) opens a menu-side version of the same readout, with three class tabs. Since there is no live player on the menu, values come from scaledStatsFor(charKey, level) - a pure mirror of applyLevelScaling - and each numeric row also shows its GAIN PER ACCOUNT LEVEL as a (+x) token (computed by diffing the helper at level vs level+1; '(+0)' for stats that don't scale, like move speed / shield / regen / lifesteal / range). It also manifests the DISTANCE UNIT (px = game pixels of the 480x270 world): MOVE SPEED in px/s, a RANGE row for LMB (projectile reach) and RMB (reach + scope) in px, and a bottom legend.</w:t>
+        <w:t>CHARACTER PARAMETERS screen (STATE.PARAMETERS): a PARAMETERS button on the MENU (top-right, just below the profile bar's COINS line) opens a menu-side version of the same readout, with FIVE class tabs. Since there is no live player on the menu, values come from scaledStatsFor(charKey, level) - a pure mirror of applyLevelScaling - and each numeric row also shows its GAIN PER ACCOUNT LEVEL as a (+x) token (computed by diffing the helper at level vs level+1). MOVE SPEED now SCALES too (+1 px/s per level, capped +35), so it shows a real (+1) delta; only shield / regen / lifesteal / RANGE read (+0). It also manifests the DISTANCE UNIT (px = game pixels of the 480x270 world): MOVE SPEED in px/s, a RANGE row for LMB (projectile reach) and RMB (reach + scope) in px, and a bottom legend.</w:t>
       </w:r>
     </w:p>
     <w:p>
@@ -719,6 +719,30 @@
       </w:pPr>
       <w:r>
         <w:t>5-TIER WEAPON EVOLUTION (account-level, separate from the active-skill tiers): weaponTierFor(level) = min(5, floor((level-1)/8)+1), so tiers 1/2/3/4/5 unlock at account level 1/9/17/25/33, with WEAPON_TIER_MULT = [1.0, 1.2, 1.5, 1.9, 2.5] multiplying the BASIC-ATTACK (LMB + held-RMB) base DAMAGE and projectile SPEED. It is cached on the player at run start (applyLevelScaling -&gt; player.weaponTier/weaponMult), stacks multiplicatively with the DAMAGE pickup (x2), and is independent of RAPID (cadence only). The Tab stats window shows a WEAPON TIER row (Tier n / 5).</w:t>
+      </w:r>
+    </w:p>
+    <w:p>
+      <w:pPr>
+        <w:pStyle w:val="ListBullet"/>
+      </w:pPr>
+      <w:r>
+        <w:t>PER-CHARACTER WEAPON SWAP (the ARMORY gained a 4th tab, WEAPONS - SEPARATE from the account-level weapon-tier multiplier above): each class can BUY an alternative model for its first (LMB) and/or second (RMB) slot from the WEAPONS / WEAPON_ORDER catalog - Syed AK-12 / Scimitar, Wu SIG M250 / Flame Blowgun, Leo Benelli M4 / Great Sword, Ong XM7 / Dragon, plus Xu's cheap single PURPLE CORE - then EQUIP it on the CHARACTER SELECT screen via clickable weapon chips that live-update the card art (default = the original inline weapon). State persists in profile.ownedWeapons / equippedWeapons. STAGE 1 is shipped: the model visually swaps in-game + on the card at the SAME hand/chest pivot (so hitboxes/scope are identical) and grants a small cached buff applied at run start (AK-12 +3% LMB dmg, SIG +3.5% atk speed, Scimitar/Great Sword +3% melee DPS, XM7 +10% gas radius, Dragon +15% mag regen, Purple Core +3% move). Three special mechanics (Purple Core shield, Blowgun blue-flame burst, Benelli pellet-explosion) are deferred STAGE 2.</w:t>
+      </w:r>
+    </w:p>
+    <w:p>
+      <w:pPr>
+        <w:pStyle w:val="ListBullet"/>
+      </w:pPr>
+      <w:r>
+        <w:t>Xu's PURPLE CORE recolor is LIVE (its STAGE-1 mechanic): equipping it RECOLORS the mech blue-&gt;purple on both the in-game sprite and the CHARACTER SELECT card, and its LMB now fires FLUORESCENT purple bullets - a fluor flag carried through createBullet drives an additive glowing-orb render in drawBulletEntity. Only its 3s-no-hit defensive shield remains deferred to STAGE 2.</w:t>
+      </w:r>
+    </w:p>
+    <w:p>
+      <w:pPr>
+        <w:pStyle w:val="ListBullet"/>
+      </w:pPr>
+      <w:r>
+        <w:t>LEAN LEVEL-1 BASE STATS + per-level GROWTH (player-side only; the enemy difficulty curve, XP, gold and all validators are untouched): the L1 base HP and move speed were cut ~30% so a fresh account starts well below its ceiling and each level-up is FELT. HP growth was sped up (LVL_HP_PER=4 / LVL_HP_CAP=9 -&gt; +1 HP every 4 account levels, max +9). NEW move-speed scaling (speed used to be flat, shown as (+0)): LVL_SPD_PER=1.0 / LVL_SPD_CAP=35 -&gt; +1 px/s per level, max +35, wired through applyLevelScaling, scaledStatsFor, the PARAMETERS MOVE SPEED row and the character-select card. The archetype spread is preserved (survivability tank&gt;...&gt;scout, speed scout&gt;...&gt;tank) and the prior soldier-dominates-scout overlap was fixed.</w:t>
       </w:r>
     </w:p>
     <w:p>

</xml_diff>